<commit_message>
qmd file for M4 Assignment 1
</commit_message>
<xml_diff>
--- a/modules/module_4_fall2024/assignments/Module4_Assignment1.docx
+++ b/modules/module_4_fall2024/assignments/Module4_Assignment1.docx
@@ -4,7 +4,7 @@
   <w:body>
     <w:p>
       <w:pPr>
-        <w:pStyle w:val="Title"/>
+        <w:pStyle w:val="Subtitle"/>
       </w:pPr>
       <w:r>
         <w:t>Module 4 Assignment 1</w:t>
@@ -12,15 +12,23 @@
     </w:p>
     <w:p>
       <w:pPr>
+        <w:pStyle w:val="Author"/>
+      </w:pPr>
+      <w:r>
+        <w:t>Ellen Bledsoe</w:t>
+      </w:r>
+    </w:p>
+    <w:p>
+      <w:pPr>
         <w:pStyle w:val="Date"/>
       </w:pPr>
       <w:r>
-        <w:t>2025-11-13</w:t>
-      </w:r>
-    </w:p>
-    <w:p>
-      <w:pPr>
-        <w:pStyle w:val="Heading2"/>
+        <w:t>2026-04-14</w:t>
+      </w:r>
+    </w:p>
+    <w:p>
+      <w:pPr>
+        <w:pStyle w:val="Heading1"/>
       </w:pPr>
       <w:bookmarkStart w:id="0" w:name="assignment-details"/>
       <w:r>
@@ -59,7 +67,7 @@
         <w:pStyle w:val="FirstParagraph"/>
       </w:pPr>
       <w:r>
-        <w:t>Use generative AI to find relevant articles, assess their relevance to your research question, and integrate scientific literature into your writing about your research question.</w:t>
+        <w:t>Use generative AI to find relevant articles, assess their relevance, and integrate scientific literature into your writing about your research question.</w:t>
       </w:r>
     </w:p>
     <w:p>
@@ -81,7 +89,7 @@
         </w:numPr>
       </w:pPr>
       <w:r>
-        <w:t>Find 10 scientific articles using the given prompts.</w:t>
+        <w:t>Find and report on 10 scientific articles using the given prompts.</w:t>
       </w:r>
     </w:p>
     <w:p>
@@ -93,7 +101,7 @@
         </w:numPr>
       </w:pPr>
       <w:r>
-        <w:t>Include the results of your search in the document.</w:t>
+        <w:t>Determine which 3 articles are most related to your research question and provide a summary of those articles.</w:t>
       </w:r>
     </w:p>
     <w:p>
@@ -105,18 +113,6 @@
         </w:numPr>
       </w:pPr>
       <w:r>
-        <w:t>Determine which 3 articles are most related to your research question and provide a summary of those articles.</w:t>
-      </w:r>
-    </w:p>
-    <w:p>
-      <w:pPr>
-        <w:pStyle w:val="Compact"/>
-        <w:numPr>
-          <w:ilvl w:val="0"/>
-          <w:numId w:val="2"/>
-        </w:numPr>
-      </w:pPr>
-      <w:r>
         <w:t>Write an abstract to a scientific article focused on your research question using the resources selected and information about your dataset.</w:t>
       </w:r>
     </w:p>
@@ -139,18 +135,8 @@
       </w:r>
     </w:p>
     <w:p>
-      <w:r>
-        <w:rPr>
-          <w:noProof/>
-        </w:rPr>
-        <w:pict w14:anchorId="3754DE53">
-          <v:rect id="_x0000_i1029" alt="" style="width:468pt;height:.05pt;mso-width-percent:0;mso-height-percent:0;mso-width-percent:0;mso-height-percent:0" o:hralign="center" o:hrstd="t" o:hr="t"/>
-        </w:pict>
-      </w:r>
-    </w:p>
-    <w:p>
-      <w:pPr>
-        <w:pStyle w:val="Heading2"/>
+      <w:pPr>
+        <w:pStyle w:val="Heading1"/>
       </w:pPr>
       <w:bookmarkStart w:id="5" w:name="assignment-instructions"/>
       <w:bookmarkEnd w:id="0"/>
@@ -172,7 +158,7 @@
         <w:pStyle w:val="BodyText"/>
       </w:pPr>
       <w:r>
-        <w:t xml:space="preserve">You will ultimately use these research articles to write an abstract for a scientific paper. You will use </w:t>
+        <w:t xml:space="preserve">You will use </w:t>
       </w:r>
       <w:r>
         <w:rPr>
@@ -182,45 +168,128 @@
         <w:t>Scholar GPT</w:t>
       </w:r>
       <w:r>
-        <w:t xml:space="preserve"> to identify relevant sources and practice synthesizing scientific information. Additionally, you’ll use an online tool to correctly format citations in APA style.</w:t>
-      </w:r>
-    </w:p>
+        <w:t xml:space="preserve"> to identify relevant sources and practice synthesizing scientific information.</w:t>
+      </w:r>
+    </w:p>
+    <w:tbl>
+      <w:tblPr>
+        <w:tblStyle w:val="Table"/>
+        <w:tblW w:w="0" w:type="auto"/>
+        <w:tblBorders>
+          <w:top w:val="single" w:sz="4" w:space="0" w:color="0758E5"/>
+          <w:left w:val="single" w:sz="24" w:space="0" w:color="0758E5"/>
+          <w:bottom w:val="single" w:sz="4" w:space="0" w:color="0758E5"/>
+          <w:right w:val="single" w:sz="4" w:space="0" w:color="0758E5"/>
+        </w:tblBorders>
+        <w:tblCellMar>
+          <w:left w:w="144" w:type="dxa"/>
+          <w:right w:w="144" w:type="dxa"/>
+        </w:tblCellMar>
+        <w:tblLook w:val="0000" w:firstRow="0" w:lastRow="0" w:firstColumn="0" w:lastColumn="0" w:noHBand="0" w:noVBand="0"/>
+      </w:tblPr>
+      <w:tblGrid>
+        <w:gridCol w:w="9648"/>
+      </w:tblGrid>
+      <w:tr>
+        <w:trPr>
+          <w:cantSplit/>
+        </w:trPr>
+        <w:tc>
+          <w:tcPr>
+            <w:tcW w:w="0" w:type="auto"/>
+            <w:shd w:val="clear" w:color="auto" w:fill="DAE6FB"/>
+            <w:tcMar>
+              <w:top w:w="92" w:type="dxa"/>
+              <w:bottom w:w="92" w:type="dxa"/>
+            </w:tcMar>
+          </w:tcPr>
+          <w:p>
+            <w:pPr>
+              <w:pStyle w:val="BodyText"/>
+              <w:spacing w:before="0" w:after="0"/>
+              <w:textAlignment w:val="center"/>
+            </w:pPr>
+            <w:r>
+              <w:rPr>
+                <w:noProof/>
+              </w:rPr>
+              <w:drawing>
+                <wp:inline distT="0" distB="0" distL="0" distR="0" wp14:anchorId="3D62469B" wp14:editId="7E3B757C">
+                  <wp:extent cx="152400" cy="152400"/>
+                  <wp:effectExtent l="0" t="0" r="0" b="0"/>
+                  <wp:docPr id="26" name="Picture"/>
+                  <wp:cNvGraphicFramePr/>
+                  <a:graphic xmlns:a="http://schemas.openxmlformats.org/drawingml/2006/main">
+                    <a:graphicData uri="http://schemas.openxmlformats.org/drawingml/2006/picture">
+                      <pic:pic xmlns:pic="http://schemas.openxmlformats.org/drawingml/2006/picture">
+                        <pic:nvPicPr>
+                          <pic:cNvPr id="27" name="Picture" descr="/Applications/quarto/share/formats/docx/note.png"/>
+                          <pic:cNvPicPr>
+                            <a:picLocks noChangeAspect="1" noChangeArrowheads="1"/>
+                          </pic:cNvPicPr>
+                        </pic:nvPicPr>
+                        <pic:blipFill>
+                          <a:blip r:embed="rId5"/>
+                          <a:stretch>
+                            <a:fillRect/>
+                          </a:stretch>
+                        </pic:blipFill>
+                        <pic:spPr bwMode="auto">
+                          <a:xfrm>
+                            <a:off x="0" y="0"/>
+                            <a:ext cx="152400" cy="152400"/>
+                          </a:xfrm>
+                          <a:prstGeom prst="rect">
+                            <a:avLst/>
+                          </a:prstGeom>
+                          <a:noFill/>
+                          <a:ln w="9525">
+                            <a:noFill/>
+                            <a:headEnd/>
+                            <a:tailEnd/>
+                          </a:ln>
+                        </pic:spPr>
+                      </pic:pic>
+                    </a:graphicData>
+                  </a:graphic>
+                </wp:inline>
+              </w:drawing>
+            </w:r>
+            <w:r>
+              <w:t xml:space="preserve">  Note</w:t>
+            </w:r>
+          </w:p>
+        </w:tc>
+      </w:tr>
+      <w:tr>
+        <w:trPr>
+          <w:cantSplit/>
+        </w:trPr>
+        <w:tc>
+          <w:tcPr>
+            <w:tcW w:w="0" w:type="auto"/>
+            <w:tcMar>
+              <w:top w:w="108" w:type="dxa"/>
+              <w:bottom w:w="108" w:type="dxa"/>
+            </w:tcMar>
+          </w:tcPr>
+          <w:p>
+            <w:pPr>
+              <w:pStyle w:val="BodyText"/>
+              <w:spacing w:before="16" w:after="16"/>
+            </w:pPr>
+            <w:r>
+              <w:t>If you feel uncomfortable using generative AI, let me know ASAP! I have a version of this lesson that focuses on accessing scientific articles from the UA library.</w:t>
+            </w:r>
+          </w:p>
+        </w:tc>
+      </w:tr>
+    </w:tbl>
     <w:p>
       <w:pPr>
         <w:pStyle w:val="BodyText"/>
       </w:pPr>
       <w:r>
-        <w:rPr>
-          <w:b/>
-          <w:bCs/>
-        </w:rPr>
-        <w:t xml:space="preserve">NOTE! </w:t>
-      </w:r>
-      <w:r>
-        <w:t>If you feel uncomfortable creating an account or using generative AI, let me know</w:t>
-      </w:r>
-      <w:r>
-        <w:t xml:space="preserve"> ASAP</w:t>
-      </w:r>
-      <w:r>
-        <w:t>–I have a version of this lesson that focuses on accessing scientific articles from the UA library.</w:t>
-      </w:r>
-    </w:p>
-    <w:p>
-      <w:pPr>
-        <w:pStyle w:val="BodyText"/>
-        <w:rPr>
-          <w:b/>
-          <w:bCs/>
-        </w:rPr>
-      </w:pPr>
-    </w:p>
-    <w:p>
-      <w:pPr>
-        <w:pStyle w:val="BodyText"/>
-      </w:pPr>
-      <w:r>
-        <w:lastRenderedPageBreak/>
         <w:t xml:space="preserve">By the way, I used </w:t>
       </w:r>
       <w:r>
@@ -231,17 +300,11 @@
         <w:t>ChatGPT</w:t>
       </w:r>
       <w:r>
-        <w:t xml:space="preserve"> to help me create this assignment! It took a lot of iteration and very specific prompts, and I still needed to make numerous edits. Generative AI is awesome as a partner, but you need to make sure you are using it critically, not as the only tool.</w:t>
-      </w:r>
-    </w:p>
-    <w:p>
-      <w:r>
-        <w:rPr>
-          <w:noProof/>
-        </w:rPr>
-        <w:pict w14:anchorId="3BD4385D">
-          <v:rect id="_x0000_i1028" alt="" style="width:468pt;height:.05pt;mso-width-percent:0;mso-height-percent:0;mso-width-percent:0;mso-height-percent:0" o:hralign="center" o:hrstd="t" o:hr="t"/>
-        </w:pict>
+        <w:t xml:space="preserve"> to help me create this assignment! It took a lot of iteration and very specific prompts, and I still needed to make numerous edits. Generative AI is </w:t>
+      </w:r>
+      <w:r>
+        <w:lastRenderedPageBreak/>
+        <w:t>awesome as a partner, but you need to make sure you are using it critically, not as the only tool.</w:t>
       </w:r>
     </w:p>
     <w:p>
@@ -249,7 +312,6 @@
         <w:pStyle w:val="Heading2"/>
       </w:pPr>
       <w:bookmarkStart w:id="6" w:name="X53a1ea8905dd231510c08b39f5e757741aa4f77"/>
-      <w:bookmarkEnd w:id="5"/>
       <w:r>
         <w:t>Part 1: Find 10 Relevant Articles (5 Points)</w:t>
       </w:r>
@@ -288,7 +350,7 @@
       <w:r>
         <w:t xml:space="preserve">Open </w:t>
       </w:r>
-      <w:hyperlink r:id="rId5">
+      <w:hyperlink r:id="rId6">
         <w:r>
           <w:rPr>
             <w:rStyle w:val="Hyperlink"/>
@@ -300,24 +362,129 @@
         <w:t>. If you have an account with ChatGPT, sign in. If you do not, you can create a free account.</w:t>
       </w:r>
     </w:p>
-    <w:p>
-      <w:pPr>
-        <w:pStyle w:val="BodyText"/>
-      </w:pPr>
-      <w:r>
-        <w:rPr>
-          <w:b/>
-          <w:bCs/>
-        </w:rPr>
-        <w:t>NOTE!</w:t>
-      </w:r>
-      <w:r>
-        <w:t xml:space="preserve"> </w:t>
-      </w:r>
-      <w:r>
-        <w:t>Make sure you make your way back to Scholar GPT! If you log in with your ChatGPT account, it will likely take you to ChatGPT, not Scholar GPT.</w:t>
-      </w:r>
-    </w:p>
+    <w:tbl>
+      <w:tblPr>
+        <w:tblStyle w:val="Table"/>
+        <w:tblW w:w="0" w:type="auto"/>
+        <w:tblBorders>
+          <w:top w:val="single" w:sz="4" w:space="0" w:color="0758E5"/>
+          <w:left w:val="single" w:sz="24" w:space="0" w:color="0758E5"/>
+          <w:bottom w:val="single" w:sz="4" w:space="0" w:color="0758E5"/>
+          <w:right w:val="single" w:sz="4" w:space="0" w:color="0758E5"/>
+        </w:tblBorders>
+        <w:tblCellMar>
+          <w:left w:w="144" w:type="dxa"/>
+          <w:right w:w="144" w:type="dxa"/>
+        </w:tblCellMar>
+        <w:tblLook w:val="0000" w:firstRow="0" w:lastRow="0" w:firstColumn="0" w:lastColumn="0" w:noHBand="0" w:noVBand="0"/>
+      </w:tblPr>
+      <w:tblGrid>
+        <w:gridCol w:w="9558"/>
+      </w:tblGrid>
+      <w:tr>
+        <w:trPr>
+          <w:cantSplit/>
+        </w:trPr>
+        <w:tc>
+          <w:tcPr>
+            <w:tcW w:w="0" w:type="auto"/>
+            <w:shd w:val="clear" w:color="auto" w:fill="DAE6FB"/>
+            <w:tcMar>
+              <w:top w:w="92" w:type="dxa"/>
+              <w:bottom w:w="92" w:type="dxa"/>
+            </w:tcMar>
+          </w:tcPr>
+          <w:p>
+            <w:pPr>
+              <w:pStyle w:val="BodyText"/>
+              <w:spacing w:before="0" w:after="0"/>
+              <w:textAlignment w:val="center"/>
+            </w:pPr>
+            <w:r>
+              <w:rPr>
+                <w:noProof/>
+              </w:rPr>
+              <w:drawing>
+                <wp:inline distT="0" distB="0" distL="0" distR="0" wp14:anchorId="4A16FECC" wp14:editId="6F39AF8C">
+                  <wp:extent cx="152400" cy="152400"/>
+                  <wp:effectExtent l="0" t="0" r="0" b="0"/>
+                  <wp:docPr id="30" name="Picture"/>
+                  <wp:cNvGraphicFramePr/>
+                  <a:graphic xmlns:a="http://schemas.openxmlformats.org/drawingml/2006/main">
+                    <a:graphicData uri="http://schemas.openxmlformats.org/drawingml/2006/picture">
+                      <pic:pic xmlns:pic="http://schemas.openxmlformats.org/drawingml/2006/picture">
+                        <pic:nvPicPr>
+                          <pic:cNvPr id="31" name="Picture" descr="/Applications/quarto/share/formats/docx/note.png"/>
+                          <pic:cNvPicPr>
+                            <a:picLocks noChangeAspect="1" noChangeArrowheads="1"/>
+                          </pic:cNvPicPr>
+                        </pic:nvPicPr>
+                        <pic:blipFill>
+                          <a:blip r:embed="rId5"/>
+                          <a:stretch>
+                            <a:fillRect/>
+                          </a:stretch>
+                        </pic:blipFill>
+                        <pic:spPr bwMode="auto">
+                          <a:xfrm>
+                            <a:off x="0" y="0"/>
+                            <a:ext cx="152400" cy="152400"/>
+                          </a:xfrm>
+                          <a:prstGeom prst="rect">
+                            <a:avLst/>
+                          </a:prstGeom>
+                          <a:noFill/>
+                          <a:ln w="9525">
+                            <a:noFill/>
+                            <a:headEnd/>
+                            <a:tailEnd/>
+                          </a:ln>
+                        </pic:spPr>
+                      </pic:pic>
+                    </a:graphicData>
+                  </a:graphic>
+                </wp:inline>
+              </w:drawing>
+            </w:r>
+            <w:r>
+              <w:t xml:space="preserve">  Note</w:t>
+            </w:r>
+          </w:p>
+        </w:tc>
+      </w:tr>
+      <w:tr>
+        <w:trPr>
+          <w:cantSplit/>
+        </w:trPr>
+        <w:tc>
+          <w:tcPr>
+            <w:tcW w:w="0" w:type="auto"/>
+            <w:tcMar>
+              <w:top w:w="108" w:type="dxa"/>
+              <w:bottom w:w="108" w:type="dxa"/>
+            </w:tcMar>
+          </w:tcPr>
+          <w:p>
+            <w:pPr>
+              <w:pStyle w:val="BodyText"/>
+              <w:spacing w:before="16"/>
+            </w:pPr>
+            <w:r>
+              <w:t>Make sure you make your way back to Scholar GPT!</w:t>
+            </w:r>
+          </w:p>
+          <w:p>
+            <w:pPr>
+              <w:pStyle w:val="BodyText"/>
+              <w:spacing w:after="16"/>
+            </w:pPr>
+            <w:r>
+              <w:t>If you log in with your ChatGPT account, it will likely take you to ChatGPT, not Scholar GPT.</w:t>
+            </w:r>
+          </w:p>
+        </w:tc>
+      </w:tr>
+    </w:tbl>
     <w:p>
       <w:pPr>
         <w:pStyle w:val="Heading3"/>
@@ -373,13 +540,7 @@
         </w:numPr>
       </w:pPr>
       <w:r>
-        <w:rPr>
-          <w:u w:val="single"/>
-        </w:rPr>
-        <w:t xml:space="preserve">Include a clear and concise version of your research question in the prompt. </w:t>
-      </w:r>
-      <w:r>
-        <w:t>That said, though, most research papers will be written about your general topic but rarely about your exact dataset or exact question. Think about the general trend that your research question is asking.</w:t>
+        <w:t>Include a clear and concise version of your research question in the prompt. That said, though, most research papers will be written about your general topic but rarely about your exact dataset or exact question. Think about the general trend that your research question is asking.</w:t>
       </w:r>
     </w:p>
     <w:p>
@@ -391,16 +552,7 @@
         </w:numPr>
       </w:pPr>
       <w:r>
-        <w:t xml:space="preserve">Also </w:t>
-      </w:r>
-      <w:r>
-        <w:rPr>
-          <w:u w:val="single"/>
-        </w:rPr>
-        <w:t>include clear instructions for the outputs that Scholar GPT should provide</w:t>
-      </w:r>
-      <w:r>
-        <w:t>. In this case, make sure that each article has a summary that is 3-5 sentences.</w:t>
+        <w:t>Also include clear instructions for the outputs that Scholar GPT should provide. In this case, make sure that each article has a summary that is 3-5 sentences.</w:t>
       </w:r>
     </w:p>
     <w:p>
@@ -412,13 +564,7 @@
         </w:numPr>
       </w:pPr>
       <w:r>
-        <w:rPr>
-          <w:u w:val="single"/>
-        </w:rPr>
-        <w:t>You might have to ask again to get what you want</w:t>
-      </w:r>
-      <w:r>
-        <w:t xml:space="preserve">. I gave Scholar GPT the following prompt: </w:t>
+        <w:t xml:space="preserve">You might have to ask again to get what you want. I gave Scholar GPT the following prompt: </w:t>
       </w:r>
       <w:r>
         <w:rPr>
@@ -446,7 +592,6 @@
         <w:pStyle w:val="FirstParagraph"/>
       </w:pPr>
       <w:r>
-        <w:lastRenderedPageBreak/>
         <w:t>You might need to write a few different versions of your prompt until you get results from Scholar GPT that make sense. This iterative process is a really important part of using generative AI responsibly!</w:t>
       </w:r>
     </w:p>
@@ -457,6 +602,7 @@
       <w:bookmarkStart w:id="10" w:name="include-your-results"/>
       <w:bookmarkEnd w:id="9"/>
       <w:r>
+        <w:lastRenderedPageBreak/>
         <w:t>Include Your Results</w:t>
       </w:r>
     </w:p>
@@ -523,16 +669,6 @@
       </w:r>
     </w:p>
     <w:p>
-      <w:r>
-        <w:rPr>
-          <w:noProof/>
-        </w:rPr>
-        <w:pict w14:anchorId="39C6BB05">
-          <v:rect id="_x0000_i1027" alt="" style="width:468pt;height:.05pt;mso-width-percent:0;mso-height-percent:0;mso-width-percent:0;mso-height-percent:0" o:hralign="center" o:hrstd="t" o:hr="t"/>
-        </w:pict>
-      </w:r>
-    </w:p>
-    <w:p>
       <w:pPr>
         <w:pStyle w:val="Heading2"/>
       </w:pPr>
@@ -642,28 +778,46 @@
     </w:p>
     <w:p>
       <w:pPr>
+        <w:pStyle w:val="BodyText"/>
+      </w:pPr>
+      <w:r>
+        <w:t>Now that you’ve gotten your results, click on the link that Scholar GPT has provided (either the DOI or the link in the list of 10 articles). For most of your articles, even if you aren’t logged into UA WiFi, you should still be able to see the abstract of the article.</w:t>
+      </w:r>
+    </w:p>
+    <w:p>
+      <w:pPr>
+        <w:pStyle w:val="BodyText"/>
+      </w:pPr>
+      <w:r>
+        <w:t>Does the abstract of the article match the abstract that Scholar GPT provided? Does it contain more or less information? Do you see any issues with what Scholar GPT has provided? Write 3-5 sentences discussing this. (2 points)</w:t>
+      </w:r>
+    </w:p>
+    <w:p>
+      <w:pPr>
+        <w:pStyle w:val="BodyText"/>
+      </w:pPr>
+      <w:r>
+        <w:rPr>
+          <w:i/>
+          <w:iCs/>
+        </w:rPr>
+        <w:t>Answer</w:t>
+      </w:r>
+      <w:r>
+        <w:t>:</w:t>
+      </w:r>
+    </w:p>
+    <w:p>
+      <w:pPr>
+        <w:pStyle w:val="Compact"/>
         <w:numPr>
           <w:ilvl w:val="0"/>
           <w:numId w:val="8"/>
         </w:numPr>
       </w:pPr>
       <w:r>
-        <w:t xml:space="preserve">Now that you’ve gotten your results, click on the link that Scholar GPT has provided (either the DOI or the link in the list of 10 articles). For most of your articles, even if </w:t>
-      </w:r>
-      <w:r>
         <w:lastRenderedPageBreak/>
-        <w:t>you aren’t logged into UA WiFi, you should still be able to see the abstract of the article.</w:t>
-      </w:r>
-    </w:p>
-    <w:p>
-      <w:pPr>
-        <w:numPr>
-          <w:ilvl w:val="0"/>
-          <w:numId w:val="1"/>
-        </w:numPr>
-      </w:pPr>
-      <w:r>
-        <w:t>Does the abstract of the article match the abstract that Scholar GPT provided? Does it contain more or less information? Do you see any issues with what Scholar GPT has provided? Write 3-5 sentences discussing this. (2 points)</w:t>
+        <w:t>For each article, write 1-2 sentences explaining why it is relevant or valuable to your research question. (3 points)</w:t>
       </w:r>
     </w:p>
     <w:p>
@@ -675,7 +829,66 @@
           <w:i/>
           <w:iCs/>
         </w:rPr>
-        <w:t>Answer:</w:t>
+        <w:t>First Article</w:t>
+      </w:r>
+      <w:r>
+        <w:t>:</w:t>
+      </w:r>
+    </w:p>
+    <w:p>
+      <w:pPr>
+        <w:pStyle w:val="BodyText"/>
+      </w:pPr>
+      <w:r>
+        <w:rPr>
+          <w:i/>
+          <w:iCs/>
+        </w:rPr>
+        <w:t>Second Article</w:t>
+      </w:r>
+      <w:r>
+        <w:t>:</w:t>
+      </w:r>
+    </w:p>
+    <w:p>
+      <w:pPr>
+        <w:pStyle w:val="BodyText"/>
+      </w:pPr>
+      <w:r>
+        <w:rPr>
+          <w:i/>
+          <w:iCs/>
+        </w:rPr>
+        <w:t>Third Article</w:t>
+      </w:r>
+      <w:r>
+        <w:t>:</w:t>
+      </w:r>
+    </w:p>
+    <w:p>
+      <w:pPr>
+        <w:pStyle w:val="Heading2"/>
+      </w:pPr>
+      <w:bookmarkStart w:id="12" w:name="Xa254372606a25381edcca9c74e69bcd4732d096"/>
+      <w:bookmarkEnd w:id="11"/>
+      <w:r>
+        <w:t>Part 3: Write an Abstract Using Selected Articles (5 Points)</w:t>
+      </w:r>
+    </w:p>
+    <w:p>
+      <w:pPr>
+        <w:pStyle w:val="FirstParagraph"/>
+      </w:pPr>
+      <w:r>
+        <w:t>Using at least 2 of the 3 articles you selected in Part 2, write an abstract for your research question. While you may not yet have the complete results for your research question, you can outline the data you are using, your research question, and your predicted results or actual results.</w:t>
+      </w:r>
+    </w:p>
+    <w:p>
+      <w:pPr>
+        <w:pStyle w:val="BodyText"/>
+      </w:pPr>
+      <w:r>
+        <w:t>For full credit, the abstract should:</w:t>
       </w:r>
     </w:p>
     <w:p>
@@ -687,7 +900,64 @@
         </w:numPr>
       </w:pPr>
       <w:r>
-        <w:t>For each article, write 1-2 sentences explaining why it is relevant or valuable to your research question. (3 points)</w:t>
+        <w:t>Include an opening sentence about the general topic of interest.</w:t>
+      </w:r>
+    </w:p>
+    <w:p>
+      <w:pPr>
+        <w:pStyle w:val="Compact"/>
+        <w:numPr>
+          <w:ilvl w:val="0"/>
+          <w:numId w:val="9"/>
+        </w:numPr>
+      </w:pPr>
+      <w:r>
+        <w:t>Include 1-2 sentences about the data (e.g., its source, type, or relevance).</w:t>
+      </w:r>
+    </w:p>
+    <w:p>
+      <w:pPr>
+        <w:pStyle w:val="Compact"/>
+        <w:numPr>
+          <w:ilvl w:val="0"/>
+          <w:numId w:val="9"/>
+        </w:numPr>
+      </w:pPr>
+      <w:r>
+        <w:t>Clearly state your research question in 1 sentence.</w:t>
+      </w:r>
+    </w:p>
+    <w:p>
+      <w:pPr>
+        <w:pStyle w:val="Compact"/>
+        <w:numPr>
+          <w:ilvl w:val="0"/>
+          <w:numId w:val="9"/>
+        </w:numPr>
+      </w:pPr>
+      <w:r>
+        <w:t>Use at least 2 sentences to reference the selected articles, supporting your research question, predicted results, or actual results. You should use in-text citations to reference your articles. See examples of in-text citations in the example abstract below.</w:t>
+      </w:r>
+    </w:p>
+    <w:p>
+      <w:pPr>
+        <w:pStyle w:val="Compact"/>
+        <w:numPr>
+          <w:ilvl w:val="0"/>
+          <w:numId w:val="9"/>
+        </w:numPr>
+      </w:pPr>
+      <w:r>
+        <w:t>Your abstract should be a minimum of 4 sentences.</w:t>
+      </w:r>
+    </w:p>
+    <w:p>
+      <w:pPr>
+        <w:pStyle w:val="Heading4"/>
+      </w:pPr>
+      <w:bookmarkStart w:id="13" w:name="example-abstract"/>
+      <w:r>
+        <w:t>Example Abstract:</w:t>
       </w:r>
     </w:p>
     <w:p>
@@ -695,80 +965,7 @@
         <w:pStyle w:val="FirstParagraph"/>
       </w:pPr>
       <w:r>
-        <w:rPr>
-          <w:i/>
-          <w:iCs/>
-        </w:rPr>
-        <w:t>First Article</w:t>
-      </w:r>
-      <w:r>
-        <w:t>:</w:t>
-      </w:r>
-    </w:p>
-    <w:p>
-      <w:pPr>
-        <w:pStyle w:val="BodyText"/>
-      </w:pPr>
-      <w:r>
-        <w:rPr>
-          <w:i/>
-          <w:iCs/>
-        </w:rPr>
-        <w:t>Second Article</w:t>
-      </w:r>
-      <w:r>
-        <w:t>:</w:t>
-      </w:r>
-    </w:p>
-    <w:p>
-      <w:pPr>
-        <w:pStyle w:val="BodyText"/>
-      </w:pPr>
-      <w:r>
-        <w:rPr>
-          <w:i/>
-          <w:iCs/>
-        </w:rPr>
-        <w:t>Third Article</w:t>
-      </w:r>
-      <w:r>
-        <w:t>:</w:t>
-      </w:r>
-    </w:p>
-    <w:p>
-      <w:r>
-        <w:rPr>
-          <w:noProof/>
-        </w:rPr>
-        <w:pict w14:anchorId="73329794">
-          <v:rect id="_x0000_i1026" alt="" style="width:468pt;height:.05pt;mso-width-percent:0;mso-height-percent:0;mso-width-percent:0;mso-height-percent:0" o:hralign="center" o:hrstd="t" o:hr="t"/>
-        </w:pict>
-      </w:r>
-    </w:p>
-    <w:p>
-      <w:pPr>
-        <w:pStyle w:val="Heading2"/>
-      </w:pPr>
-      <w:bookmarkStart w:id="12" w:name="Xa254372606a25381edcca9c74e69bcd4732d096"/>
-      <w:bookmarkEnd w:id="11"/>
-      <w:r>
-        <w:t>Part 3: Write an Abstract Using Selected Articles (5 Points)</w:t>
-      </w:r>
-    </w:p>
-    <w:p>
-      <w:pPr>
-        <w:pStyle w:val="FirstParagraph"/>
-      </w:pPr>
-      <w:r>
-        <w:t>Using at least 2 of the 3 articles you selected in Part 2, write an abstract for your research question. While you may not yet have the complete results for your research question, you can outline the data you are using, your research question, and your predicted results or actual results.</w:t>
-      </w:r>
-    </w:p>
-    <w:p>
-      <w:pPr>
-        <w:pStyle w:val="BodyText"/>
-      </w:pPr>
-      <w:r>
-        <w:t>For full credit, the abstract should:</w:t>
+        <w:t>Urbanization has been shown by many scholars to correlate with reduced bird populations (Johnson et al. 2021). Smith and Doe (2020) specifically demonstrated that urban sprawl leads to habitat fragmentation, which disrupts migratory routes. This study utilizes data from the National Bird Migration Database, focusing on population trends across urbanized regions. The research question examines how urbanization affects the migratory behaviors of birds. Based on these findings, I predict a decline in migratory bird populations in highly urbanized areas.</w:t>
       </w:r>
     </w:p>
     <w:p>
@@ -780,104 +977,33 @@
         </w:numPr>
       </w:pPr>
       <w:r>
-        <w:t>Include an opening sentence about the general topic of interest.</w:t>
-      </w:r>
-    </w:p>
-    <w:p>
-      <w:pPr>
-        <w:pStyle w:val="Compact"/>
-        <w:numPr>
-          <w:ilvl w:val="0"/>
-          <w:numId w:val="10"/>
-        </w:numPr>
-      </w:pPr>
-      <w:r>
-        <w:t xml:space="preserve">Include </w:t>
-      </w:r>
+        <w:t>Write your abstract here. It can follow a similar structure of the one above or be a little different, but it should follow the guidelines above for full credit. (5 points)</w:t>
+      </w:r>
+    </w:p>
+    <w:p>
+      <w:pPr>
+        <w:pStyle w:val="FirstParagraph"/>
+      </w:pPr>
       <w:r>
         <w:rPr>
-          <w:u w:val="single"/>
+          <w:i/>
+          <w:iCs/>
         </w:rPr>
-        <w:t>1-2 sentences about the data</w:t>
-      </w:r>
-      <w:r>
-        <w:t xml:space="preserve"> (e.g., its source, type, or relevance).</w:t>
-      </w:r>
-    </w:p>
-    <w:p>
-      <w:pPr>
-        <w:pStyle w:val="Compact"/>
-        <w:numPr>
-          <w:ilvl w:val="0"/>
-          <w:numId w:val="10"/>
-        </w:numPr>
-      </w:pPr>
-      <w:r>
-        <w:t xml:space="preserve">Clearly state your </w:t>
-      </w:r>
-      <w:r>
-        <w:rPr>
-          <w:u w:val="single"/>
-        </w:rPr>
-        <w:t>research question in 1 sentence</w:t>
-      </w:r>
-      <w:r>
-        <w:rPr>
-          <w:b/>
-          <w:bCs/>
-        </w:rPr>
-        <w:t>.</w:t>
-      </w:r>
-    </w:p>
-    <w:p>
-      <w:pPr>
-        <w:pStyle w:val="Compact"/>
-        <w:numPr>
-          <w:ilvl w:val="0"/>
-          <w:numId w:val="10"/>
-        </w:numPr>
-      </w:pPr>
-      <w:r>
-        <w:t xml:space="preserve">Use </w:t>
-      </w:r>
-      <w:r>
-        <w:rPr>
-          <w:u w:val="single"/>
-        </w:rPr>
-        <w:t>at least 2 sentences</w:t>
-      </w:r>
-      <w:r>
-        <w:t xml:space="preserve"> to reference the selected articles, supporting your research question, predicted results, or actual results. You should use </w:t>
-      </w:r>
-      <w:r>
-        <w:rPr>
-          <w:u w:val="single"/>
-        </w:rPr>
-        <w:t>in-text citations to reference your articles</w:t>
-      </w:r>
-      <w:r>
-        <w:t>. See examples of in-text citations in the example abstract below.</w:t>
-      </w:r>
-    </w:p>
-    <w:p>
-      <w:pPr>
-        <w:pStyle w:val="Compact"/>
-        <w:numPr>
-          <w:ilvl w:val="0"/>
-          <w:numId w:val="10"/>
-        </w:numPr>
-      </w:pPr>
-      <w:r>
-        <w:t>Your abstract should be a minimum of 4 sentences.</w:t>
-      </w:r>
-    </w:p>
-    <w:p>
-      <w:pPr>
-        <w:pStyle w:val="Heading4"/>
-      </w:pPr>
-      <w:bookmarkStart w:id="13" w:name="example-abstract"/>
-      <w:r>
-        <w:t>Example Abstract:</w:t>
+        <w:t>Abstract</w:t>
+      </w:r>
+      <w:r>
+        <w:t>:</w:t>
+      </w:r>
+    </w:p>
+    <w:p>
+      <w:pPr>
+        <w:pStyle w:val="Heading2"/>
+      </w:pPr>
+      <w:bookmarkStart w:id="14" w:name="part-4-reflection-2-points"/>
+      <w:bookmarkEnd w:id="12"/>
+      <w:bookmarkEnd w:id="13"/>
+      <w:r>
+        <w:t>Part 4: Reflection (2 points)</w:t>
       </w:r>
     </w:p>
     <w:p>
@@ -885,7 +1011,16 @@
         <w:pStyle w:val="FirstParagraph"/>
       </w:pPr>
       <w:r>
-        <w:t>Urbanization has been shown by many scholars to correlate with reduced bird populations (Johnson et al. 2021). Smith and Doe (2020) specifically demonstrated that urban sprawl leads to habitat fragmentation, which disrupts migratory routes. This study utilizes data from the National Bird Migration Database, focusing on population trends across urbanized regions. The research question examines how urbanization affects the migratory behaviors of birds. Based on these findings, I predict a decline in migratory bird populations in highly urbanized areas.</w:t>
+        <w:t>In this assignment, you’ve used generative AI to help you find scientific literature related to your research topic, summarize and cite those research papers, and write an abstract.</w:t>
+      </w:r>
+    </w:p>
+    <w:p>
+      <w:pPr>
+        <w:pStyle w:val="BodyText"/>
+      </w:pPr>
+      <w:r>
+        <w:lastRenderedPageBreak/>
+        <w:t>In some ways, generative AI probably did a great job; in other ways, it probably did not perform its task as directed. I know that I had to spend another 2 hours to finalize the creation of this assignment, even after generative AI produced a nice outline for me!</w:t>
       </w:r>
     </w:p>
     <w:p>
@@ -897,71 +1032,6 @@
         </w:numPr>
       </w:pPr>
       <w:r>
-        <w:lastRenderedPageBreak/>
-        <w:t>Write your abstract here. It can follow a similar structure of the one above or be a little different, but it should follow the guidelines above for full credit. (5 points)</w:t>
-      </w:r>
-    </w:p>
-    <w:p>
-      <w:pPr>
-        <w:pStyle w:val="FirstParagraph"/>
-      </w:pPr>
-      <w:r>
-        <w:rPr>
-          <w:i/>
-          <w:iCs/>
-        </w:rPr>
-        <w:t>Abstract</w:t>
-      </w:r>
-      <w:r>
-        <w:t>:</w:t>
-      </w:r>
-    </w:p>
-    <w:p>
-      <w:r>
-        <w:rPr>
-          <w:noProof/>
-        </w:rPr>
-        <w:pict w14:anchorId="56EDFF26">
-          <v:rect id="_x0000_i1025" alt="" style="width:468pt;height:.05pt;mso-width-percent:0;mso-height-percent:0;mso-width-percent:0;mso-height-percent:0" o:hralign="center" o:hrstd="t" o:hr="t"/>
-        </w:pict>
-      </w:r>
-    </w:p>
-    <w:p>
-      <w:pPr>
-        <w:pStyle w:val="Heading2"/>
-      </w:pPr>
-      <w:bookmarkStart w:id="14" w:name="part-4-reflection-2-points"/>
-      <w:bookmarkEnd w:id="12"/>
-      <w:bookmarkEnd w:id="13"/>
-      <w:r>
-        <w:t>Part 4: Reflection (2 points)</w:t>
-      </w:r>
-    </w:p>
-    <w:p>
-      <w:pPr>
-        <w:pStyle w:val="FirstParagraph"/>
-      </w:pPr>
-      <w:r>
-        <w:t>In this assignment, you’ve used generative AI to help you find scientific literature related to your research topic, summarize and cite those research papers, and write an abstract.</w:t>
-      </w:r>
-    </w:p>
-    <w:p>
-      <w:pPr>
-        <w:pStyle w:val="BodyText"/>
-      </w:pPr>
-      <w:r>
-        <w:t>In some ways, generative AI probably did a great job; in other ways, it probably did not perform its task as directed. I know that I had to spend another 2 hours to finalize the creation of this assignment, even after generative AI produced a nice outline for me!</w:t>
-      </w:r>
-    </w:p>
-    <w:p>
-      <w:pPr>
-        <w:pStyle w:val="Compact"/>
-        <w:numPr>
-          <w:ilvl w:val="0"/>
-          <w:numId w:val="12"/>
-        </w:numPr>
-      </w:pPr>
-      <w:r>
         <w:t xml:space="preserve">Based on your experiences in this assignment, what are your takeaways about using generative AI to help conduct research or generally answer questions? Where does it excel? What are potential pitfalls? Your response should be at least 4 sentences (and should </w:t>
       </w:r>
       <w:r>
@@ -988,12 +1058,13 @@
       <w:r>
         <w:t>:</w:t>
       </w:r>
+      <w:bookmarkEnd w:id="5"/>
       <w:bookmarkEnd w:id="14"/>
-      <w:r>
-        <w:t xml:space="preserve"> </w:t>
-      </w:r>
     </w:p>
     <w:sectPr>
+      <w:footnotePr>
+        <w:numRestart w:val="eachSect"/>
+      </w:footnotePr>
       <w:pgSz w:w="12240" w:h="15840"/>
       <w:pgMar w:top="1440" w:right="1440" w:bottom="1440" w:left="1440" w:header="720" w:footer="720" w:gutter="0"/>
       <w:cols w:space="720"/>
@@ -1007,7 +1078,7 @@
   <w:abstractNum w:abstractNumId="0" w15:restartNumberingAfterBreak="0">
     <w:nsid w:val="0000A990"/>
     <w:multiLevelType w:val="multilevel"/>
-    <w:tmpl w:val="A71A2AA6"/>
+    <w:tmpl w:val="844A7DE8"/>
     <w:lvl w:ilvl="0">
       <w:numFmt w:val="bullet"/>
       <w:lvlText w:val=" "/>
@@ -1084,7 +1155,7 @@
   <w:abstractNum w:abstractNumId="1" w15:restartNumberingAfterBreak="0">
     <w:nsid w:val="0000A991"/>
     <w:multiLevelType w:val="multilevel"/>
-    <w:tmpl w:val="3A08AF76"/>
+    <w:tmpl w:val="B58AF27A"/>
     <w:lvl w:ilvl="0">
       <w:numFmt w:val="bullet"/>
       <w:lvlText w:val=""/>
@@ -1185,832 +1256,38 @@
       </w:rPr>
     </w:lvl>
   </w:abstractNum>
-  <w:abstractNum w:abstractNumId="2" w15:restartNumberingAfterBreak="0">
-    <w:nsid w:val="00A99411"/>
-    <w:multiLevelType w:val="multilevel"/>
-    <w:tmpl w:val="11C4FF26"/>
-    <w:lvl w:ilvl="0">
-      <w:start w:val="1"/>
-      <w:numFmt w:val="decimal"/>
-      <w:lvlText w:val="%1."/>
-      <w:lvlJc w:val="left"/>
-      <w:pPr>
-        <w:ind w:left="720" w:hanging="360"/>
-      </w:pPr>
-    </w:lvl>
-    <w:lvl w:ilvl="1">
-      <w:start w:val="1"/>
-      <w:numFmt w:val="decimal"/>
-      <w:lvlText w:val="%2."/>
-      <w:lvlJc w:val="left"/>
-      <w:pPr>
-        <w:ind w:left="1440" w:hanging="360"/>
-      </w:pPr>
-    </w:lvl>
-    <w:lvl w:ilvl="2">
-      <w:start w:val="1"/>
-      <w:numFmt w:val="decimal"/>
-      <w:lvlText w:val="%3."/>
-      <w:lvlJc w:val="left"/>
-      <w:pPr>
-        <w:ind w:left="2160" w:hanging="360"/>
-      </w:pPr>
-    </w:lvl>
-    <w:lvl w:ilvl="3">
-      <w:start w:val="1"/>
-      <w:numFmt w:val="decimal"/>
-      <w:lvlText w:val="%4."/>
-      <w:lvlJc w:val="left"/>
-      <w:pPr>
-        <w:ind w:left="2880" w:hanging="360"/>
-      </w:pPr>
-    </w:lvl>
-    <w:lvl w:ilvl="4">
-      <w:start w:val="1"/>
-      <w:numFmt w:val="decimal"/>
-      <w:lvlText w:val="%5."/>
-      <w:lvlJc w:val="left"/>
-      <w:pPr>
-        <w:ind w:left="3600" w:hanging="360"/>
-      </w:pPr>
-    </w:lvl>
-    <w:lvl w:ilvl="5">
-      <w:start w:val="1"/>
-      <w:numFmt w:val="decimal"/>
-      <w:lvlText w:val="%6."/>
-      <w:lvlJc w:val="left"/>
-      <w:pPr>
-        <w:ind w:left="4320" w:hanging="360"/>
-      </w:pPr>
-    </w:lvl>
-    <w:lvl w:ilvl="6">
-      <w:start w:val="1"/>
-      <w:numFmt w:val="decimal"/>
-      <w:lvlText w:val="%7."/>
-      <w:lvlJc w:val="left"/>
-      <w:pPr>
-        <w:ind w:left="5040" w:hanging="360"/>
-      </w:pPr>
-    </w:lvl>
-    <w:lvl w:ilvl="7">
-      <w:start w:val="1"/>
-      <w:numFmt w:val="decimal"/>
-      <w:lvlText w:val="%8."/>
-      <w:lvlJc w:val="left"/>
-      <w:pPr>
-        <w:ind w:left="5760" w:hanging="360"/>
-      </w:pPr>
-    </w:lvl>
-    <w:lvl w:ilvl="8">
-      <w:start w:val="1"/>
-      <w:numFmt w:val="decimal"/>
-      <w:lvlText w:val="%9."/>
-      <w:lvlJc w:val="left"/>
-      <w:pPr>
-        <w:ind w:left="6480" w:hanging="360"/>
-      </w:pPr>
-    </w:lvl>
-  </w:abstractNum>
-  <w:abstractNum w:abstractNumId="3" w15:restartNumberingAfterBreak="0">
-    <w:nsid w:val="00A99412"/>
-    <w:multiLevelType w:val="multilevel"/>
-    <w:tmpl w:val="12BC0C0E"/>
-    <w:lvl w:ilvl="0">
-      <w:start w:val="2"/>
-      <w:numFmt w:val="decimal"/>
-      <w:lvlText w:val="%1."/>
-      <w:lvlJc w:val="left"/>
-      <w:pPr>
-        <w:ind w:left="720" w:hanging="360"/>
-      </w:pPr>
-    </w:lvl>
-    <w:lvl w:ilvl="1">
-      <w:start w:val="2"/>
-      <w:numFmt w:val="decimal"/>
-      <w:lvlText w:val="%2."/>
-      <w:lvlJc w:val="left"/>
-      <w:pPr>
-        <w:ind w:left="1440" w:hanging="360"/>
-      </w:pPr>
-    </w:lvl>
-    <w:lvl w:ilvl="2">
-      <w:start w:val="2"/>
-      <w:numFmt w:val="decimal"/>
-      <w:lvlText w:val="%3."/>
-      <w:lvlJc w:val="left"/>
-      <w:pPr>
-        <w:ind w:left="2160" w:hanging="360"/>
-      </w:pPr>
-    </w:lvl>
-    <w:lvl w:ilvl="3">
-      <w:start w:val="2"/>
-      <w:numFmt w:val="decimal"/>
-      <w:lvlText w:val="%4."/>
-      <w:lvlJc w:val="left"/>
-      <w:pPr>
-        <w:ind w:left="2880" w:hanging="360"/>
-      </w:pPr>
-    </w:lvl>
-    <w:lvl w:ilvl="4">
-      <w:start w:val="2"/>
-      <w:numFmt w:val="decimal"/>
-      <w:lvlText w:val="%5."/>
-      <w:lvlJc w:val="left"/>
-      <w:pPr>
-        <w:ind w:left="3600" w:hanging="360"/>
-      </w:pPr>
-    </w:lvl>
-    <w:lvl w:ilvl="5">
-      <w:start w:val="2"/>
-      <w:numFmt w:val="decimal"/>
-      <w:lvlText w:val="%6."/>
-      <w:lvlJc w:val="left"/>
-      <w:pPr>
-        <w:ind w:left="4320" w:hanging="360"/>
-      </w:pPr>
-    </w:lvl>
-    <w:lvl w:ilvl="6">
-      <w:start w:val="2"/>
-      <w:numFmt w:val="decimal"/>
-      <w:lvlText w:val="%7."/>
-      <w:lvlJc w:val="left"/>
-      <w:pPr>
-        <w:ind w:left="5040" w:hanging="360"/>
-      </w:pPr>
-    </w:lvl>
-    <w:lvl w:ilvl="7">
-      <w:start w:val="2"/>
-      <w:numFmt w:val="decimal"/>
-      <w:lvlText w:val="%8."/>
-      <w:lvlJc w:val="left"/>
-      <w:pPr>
-        <w:ind w:left="5760" w:hanging="360"/>
-      </w:pPr>
-    </w:lvl>
-    <w:lvl w:ilvl="8">
-      <w:start w:val="2"/>
-      <w:numFmt w:val="decimal"/>
-      <w:lvlText w:val="%9."/>
-      <w:lvlJc w:val="left"/>
-      <w:pPr>
-        <w:ind w:left="6480" w:hanging="360"/>
-      </w:pPr>
-    </w:lvl>
-  </w:abstractNum>
-  <w:abstractNum w:abstractNumId="4" w15:restartNumberingAfterBreak="0">
-    <w:nsid w:val="00A99413"/>
-    <w:multiLevelType w:val="multilevel"/>
-    <w:tmpl w:val="D7CA17FE"/>
-    <w:lvl w:ilvl="0">
-      <w:start w:val="3"/>
-      <w:numFmt w:val="decimal"/>
-      <w:lvlText w:val="%1."/>
-      <w:lvlJc w:val="left"/>
-      <w:pPr>
-        <w:ind w:left="720" w:hanging="360"/>
-      </w:pPr>
-    </w:lvl>
-    <w:lvl w:ilvl="1">
-      <w:start w:val="3"/>
-      <w:numFmt w:val="decimal"/>
-      <w:lvlText w:val="%2."/>
-      <w:lvlJc w:val="left"/>
-      <w:pPr>
-        <w:ind w:left="1440" w:hanging="360"/>
-      </w:pPr>
-    </w:lvl>
-    <w:lvl w:ilvl="2">
-      <w:start w:val="3"/>
-      <w:numFmt w:val="decimal"/>
-      <w:lvlText w:val="%3."/>
-      <w:lvlJc w:val="left"/>
-      <w:pPr>
-        <w:ind w:left="2160" w:hanging="360"/>
-      </w:pPr>
-    </w:lvl>
-    <w:lvl w:ilvl="3">
-      <w:start w:val="3"/>
-      <w:numFmt w:val="decimal"/>
-      <w:lvlText w:val="%4."/>
-      <w:lvlJc w:val="left"/>
-      <w:pPr>
-        <w:ind w:left="2880" w:hanging="360"/>
-      </w:pPr>
-    </w:lvl>
-    <w:lvl w:ilvl="4">
-      <w:start w:val="3"/>
-      <w:numFmt w:val="decimal"/>
-      <w:lvlText w:val="%5."/>
-      <w:lvlJc w:val="left"/>
-      <w:pPr>
-        <w:ind w:left="3600" w:hanging="360"/>
-      </w:pPr>
-    </w:lvl>
-    <w:lvl w:ilvl="5">
-      <w:start w:val="3"/>
-      <w:numFmt w:val="decimal"/>
-      <w:lvlText w:val="%6."/>
-      <w:lvlJc w:val="left"/>
-      <w:pPr>
-        <w:ind w:left="4320" w:hanging="360"/>
-      </w:pPr>
-    </w:lvl>
-    <w:lvl w:ilvl="6">
-      <w:start w:val="3"/>
-      <w:numFmt w:val="decimal"/>
-      <w:lvlText w:val="%7."/>
-      <w:lvlJc w:val="left"/>
-      <w:pPr>
-        <w:ind w:left="5040" w:hanging="360"/>
-      </w:pPr>
-    </w:lvl>
-    <w:lvl w:ilvl="7">
-      <w:start w:val="3"/>
-      <w:numFmt w:val="decimal"/>
-      <w:lvlText w:val="%8."/>
-      <w:lvlJc w:val="left"/>
-      <w:pPr>
-        <w:ind w:left="5760" w:hanging="360"/>
-      </w:pPr>
-    </w:lvl>
-    <w:lvl w:ilvl="8">
-      <w:start w:val="3"/>
-      <w:numFmt w:val="decimal"/>
-      <w:lvlText w:val="%9."/>
-      <w:lvlJc w:val="left"/>
-      <w:pPr>
-        <w:ind w:left="6480" w:hanging="360"/>
-      </w:pPr>
-    </w:lvl>
-  </w:abstractNum>
-  <w:abstractNum w:abstractNumId="5" w15:restartNumberingAfterBreak="0">
-    <w:nsid w:val="00A99414"/>
-    <w:multiLevelType w:val="multilevel"/>
-    <w:tmpl w:val="A53A3CA2"/>
-    <w:lvl w:ilvl="0">
-      <w:start w:val="4"/>
-      <w:numFmt w:val="decimal"/>
-      <w:lvlText w:val="%1."/>
-      <w:lvlJc w:val="left"/>
-      <w:pPr>
-        <w:ind w:left="720" w:hanging="360"/>
-      </w:pPr>
-    </w:lvl>
-    <w:lvl w:ilvl="1">
-      <w:start w:val="4"/>
-      <w:numFmt w:val="decimal"/>
-      <w:lvlText w:val="%2."/>
-      <w:lvlJc w:val="left"/>
-      <w:pPr>
-        <w:ind w:left="1440" w:hanging="360"/>
-      </w:pPr>
-    </w:lvl>
-    <w:lvl w:ilvl="2">
-      <w:start w:val="4"/>
-      <w:numFmt w:val="decimal"/>
-      <w:lvlText w:val="%3."/>
-      <w:lvlJc w:val="left"/>
-      <w:pPr>
-        <w:ind w:left="2160" w:hanging="360"/>
-      </w:pPr>
-    </w:lvl>
-    <w:lvl w:ilvl="3">
-      <w:start w:val="4"/>
-      <w:numFmt w:val="decimal"/>
-      <w:lvlText w:val="%4."/>
-      <w:lvlJc w:val="left"/>
-      <w:pPr>
-        <w:ind w:left="2880" w:hanging="360"/>
-      </w:pPr>
-    </w:lvl>
-    <w:lvl w:ilvl="4">
-      <w:start w:val="4"/>
-      <w:numFmt w:val="decimal"/>
-      <w:lvlText w:val="%5."/>
-      <w:lvlJc w:val="left"/>
-      <w:pPr>
-        <w:ind w:left="3600" w:hanging="360"/>
-      </w:pPr>
-    </w:lvl>
-    <w:lvl w:ilvl="5">
-      <w:start w:val="4"/>
-      <w:numFmt w:val="decimal"/>
-      <w:lvlText w:val="%6."/>
-      <w:lvlJc w:val="left"/>
-      <w:pPr>
-        <w:ind w:left="4320" w:hanging="360"/>
-      </w:pPr>
-    </w:lvl>
-    <w:lvl w:ilvl="6">
-      <w:start w:val="4"/>
-      <w:numFmt w:val="decimal"/>
-      <w:lvlText w:val="%7."/>
-      <w:lvlJc w:val="left"/>
-      <w:pPr>
-        <w:ind w:left="5040" w:hanging="360"/>
-      </w:pPr>
-    </w:lvl>
-    <w:lvl w:ilvl="7">
-      <w:start w:val="4"/>
-      <w:numFmt w:val="decimal"/>
-      <w:lvlText w:val="%8."/>
-      <w:lvlJc w:val="left"/>
-      <w:pPr>
-        <w:ind w:left="5760" w:hanging="360"/>
-      </w:pPr>
-    </w:lvl>
-    <w:lvl w:ilvl="8">
-      <w:start w:val="4"/>
-      <w:numFmt w:val="decimal"/>
-      <w:lvlText w:val="%9."/>
-      <w:lvlJc w:val="left"/>
-      <w:pPr>
-        <w:ind w:left="6480" w:hanging="360"/>
-      </w:pPr>
-    </w:lvl>
-  </w:abstractNum>
-  <w:abstractNum w:abstractNumId="6" w15:restartNumberingAfterBreak="0">
-    <w:nsid w:val="00A99415"/>
-    <w:multiLevelType w:val="multilevel"/>
-    <w:tmpl w:val="6596976C"/>
-    <w:lvl w:ilvl="0">
-      <w:start w:val="5"/>
-      <w:numFmt w:val="decimal"/>
-      <w:lvlText w:val="%1."/>
-      <w:lvlJc w:val="left"/>
-      <w:pPr>
-        <w:ind w:left="720" w:hanging="360"/>
-      </w:pPr>
-    </w:lvl>
-    <w:lvl w:ilvl="1">
-      <w:start w:val="5"/>
-      <w:numFmt w:val="decimal"/>
-      <w:lvlText w:val="%2."/>
-      <w:lvlJc w:val="left"/>
-      <w:pPr>
-        <w:ind w:left="1440" w:hanging="360"/>
-      </w:pPr>
-    </w:lvl>
-    <w:lvl w:ilvl="2">
-      <w:start w:val="5"/>
-      <w:numFmt w:val="decimal"/>
-      <w:lvlText w:val="%3."/>
-      <w:lvlJc w:val="left"/>
-      <w:pPr>
-        <w:ind w:left="2160" w:hanging="360"/>
-      </w:pPr>
-    </w:lvl>
-    <w:lvl w:ilvl="3">
-      <w:start w:val="5"/>
-      <w:numFmt w:val="decimal"/>
-      <w:lvlText w:val="%4."/>
-      <w:lvlJc w:val="left"/>
-      <w:pPr>
-        <w:ind w:left="2880" w:hanging="360"/>
-      </w:pPr>
-    </w:lvl>
-    <w:lvl w:ilvl="4">
-      <w:start w:val="5"/>
-      <w:numFmt w:val="decimal"/>
-      <w:lvlText w:val="%5."/>
-      <w:lvlJc w:val="left"/>
-      <w:pPr>
-        <w:ind w:left="3600" w:hanging="360"/>
-      </w:pPr>
-    </w:lvl>
-    <w:lvl w:ilvl="5">
-      <w:start w:val="5"/>
-      <w:numFmt w:val="decimal"/>
-      <w:lvlText w:val="%6."/>
-      <w:lvlJc w:val="left"/>
-      <w:pPr>
-        <w:ind w:left="4320" w:hanging="360"/>
-      </w:pPr>
-    </w:lvl>
-    <w:lvl w:ilvl="6">
-      <w:start w:val="5"/>
-      <w:numFmt w:val="decimal"/>
-      <w:lvlText w:val="%7."/>
-      <w:lvlJc w:val="left"/>
-      <w:pPr>
-        <w:ind w:left="5040" w:hanging="360"/>
-      </w:pPr>
-    </w:lvl>
-    <w:lvl w:ilvl="7">
-      <w:start w:val="5"/>
-      <w:numFmt w:val="decimal"/>
-      <w:lvlText w:val="%8."/>
-      <w:lvlJc w:val="left"/>
-      <w:pPr>
-        <w:ind w:left="5760" w:hanging="360"/>
-      </w:pPr>
-    </w:lvl>
-    <w:lvl w:ilvl="8">
-      <w:start w:val="5"/>
-      <w:numFmt w:val="decimal"/>
-      <w:lvlText w:val="%9."/>
-      <w:lvlJc w:val="left"/>
-      <w:pPr>
-        <w:ind w:left="6480" w:hanging="360"/>
-      </w:pPr>
-    </w:lvl>
-  </w:abstractNum>
-  <w:abstractNum w:abstractNumId="7" w15:restartNumberingAfterBreak="0">
-    <w:nsid w:val="00A99416"/>
-    <w:multiLevelType w:val="multilevel"/>
-    <w:tmpl w:val="770469DA"/>
-    <w:lvl w:ilvl="0">
-      <w:start w:val="6"/>
-      <w:numFmt w:val="decimal"/>
-      <w:lvlText w:val="%1."/>
-      <w:lvlJc w:val="left"/>
-      <w:pPr>
-        <w:ind w:left="720" w:hanging="360"/>
-      </w:pPr>
-    </w:lvl>
-    <w:lvl w:ilvl="1">
-      <w:start w:val="6"/>
-      <w:numFmt w:val="decimal"/>
-      <w:lvlText w:val="%2."/>
-      <w:lvlJc w:val="left"/>
-      <w:pPr>
-        <w:ind w:left="1440" w:hanging="360"/>
-      </w:pPr>
-    </w:lvl>
-    <w:lvl w:ilvl="2">
-      <w:start w:val="6"/>
-      <w:numFmt w:val="decimal"/>
-      <w:lvlText w:val="%3."/>
-      <w:lvlJc w:val="left"/>
-      <w:pPr>
-        <w:ind w:left="2160" w:hanging="360"/>
-      </w:pPr>
-    </w:lvl>
-    <w:lvl w:ilvl="3">
-      <w:start w:val="6"/>
-      <w:numFmt w:val="decimal"/>
-      <w:lvlText w:val="%4."/>
-      <w:lvlJc w:val="left"/>
-      <w:pPr>
-        <w:ind w:left="2880" w:hanging="360"/>
-      </w:pPr>
-    </w:lvl>
-    <w:lvl w:ilvl="4">
-      <w:start w:val="6"/>
-      <w:numFmt w:val="decimal"/>
-      <w:lvlText w:val="%5."/>
-      <w:lvlJc w:val="left"/>
-      <w:pPr>
-        <w:ind w:left="3600" w:hanging="360"/>
-      </w:pPr>
-    </w:lvl>
-    <w:lvl w:ilvl="5">
-      <w:start w:val="6"/>
-      <w:numFmt w:val="decimal"/>
-      <w:lvlText w:val="%6."/>
-      <w:lvlJc w:val="left"/>
-      <w:pPr>
-        <w:ind w:left="4320" w:hanging="360"/>
-      </w:pPr>
-    </w:lvl>
-    <w:lvl w:ilvl="6">
-      <w:start w:val="6"/>
-      <w:numFmt w:val="decimal"/>
-      <w:lvlText w:val="%7."/>
-      <w:lvlJc w:val="left"/>
-      <w:pPr>
-        <w:ind w:left="5040" w:hanging="360"/>
-      </w:pPr>
-    </w:lvl>
-    <w:lvl w:ilvl="7">
-      <w:start w:val="6"/>
-      <w:numFmt w:val="decimal"/>
-      <w:lvlText w:val="%8."/>
-      <w:lvlJc w:val="left"/>
-      <w:pPr>
-        <w:ind w:left="5760" w:hanging="360"/>
-      </w:pPr>
-    </w:lvl>
-    <w:lvl w:ilvl="8">
-      <w:start w:val="6"/>
-      <w:numFmt w:val="decimal"/>
-      <w:lvlText w:val="%9."/>
-      <w:lvlJc w:val="left"/>
-      <w:pPr>
-        <w:ind w:left="6480" w:hanging="360"/>
-      </w:pPr>
-    </w:lvl>
-  </w:abstractNum>
-  <w:abstractNum w:abstractNumId="8" w15:restartNumberingAfterBreak="0">
-    <w:nsid w:val="00A99417"/>
-    <w:multiLevelType w:val="multilevel"/>
-    <w:tmpl w:val="007265A2"/>
-    <w:lvl w:ilvl="0">
-      <w:start w:val="7"/>
-      <w:numFmt w:val="decimal"/>
-      <w:lvlText w:val="%1."/>
-      <w:lvlJc w:val="left"/>
-      <w:pPr>
-        <w:ind w:left="720" w:hanging="360"/>
-      </w:pPr>
-    </w:lvl>
-    <w:lvl w:ilvl="1">
-      <w:start w:val="7"/>
-      <w:numFmt w:val="decimal"/>
-      <w:lvlText w:val="%2."/>
-      <w:lvlJc w:val="left"/>
-      <w:pPr>
-        <w:ind w:left="1440" w:hanging="360"/>
-      </w:pPr>
-    </w:lvl>
-    <w:lvl w:ilvl="2">
-      <w:start w:val="7"/>
-      <w:numFmt w:val="decimal"/>
-      <w:lvlText w:val="%3."/>
-      <w:lvlJc w:val="left"/>
-      <w:pPr>
-        <w:ind w:left="2160" w:hanging="360"/>
-      </w:pPr>
-    </w:lvl>
-    <w:lvl w:ilvl="3">
-      <w:start w:val="7"/>
-      <w:numFmt w:val="decimal"/>
-      <w:lvlText w:val="%4."/>
-      <w:lvlJc w:val="left"/>
-      <w:pPr>
-        <w:ind w:left="2880" w:hanging="360"/>
-      </w:pPr>
-    </w:lvl>
-    <w:lvl w:ilvl="4">
-      <w:start w:val="7"/>
-      <w:numFmt w:val="decimal"/>
-      <w:lvlText w:val="%5."/>
-      <w:lvlJc w:val="left"/>
-      <w:pPr>
-        <w:ind w:left="3600" w:hanging="360"/>
-      </w:pPr>
-    </w:lvl>
-    <w:lvl w:ilvl="5">
-      <w:start w:val="7"/>
-      <w:numFmt w:val="decimal"/>
-      <w:lvlText w:val="%6."/>
-      <w:lvlJc w:val="left"/>
-      <w:pPr>
-        <w:ind w:left="4320" w:hanging="360"/>
-      </w:pPr>
-    </w:lvl>
-    <w:lvl w:ilvl="6">
-      <w:start w:val="7"/>
-      <w:numFmt w:val="decimal"/>
-      <w:lvlText w:val="%7."/>
-      <w:lvlJc w:val="left"/>
-      <w:pPr>
-        <w:ind w:left="5040" w:hanging="360"/>
-      </w:pPr>
-    </w:lvl>
-    <w:lvl w:ilvl="7">
-      <w:start w:val="7"/>
-      <w:numFmt w:val="decimal"/>
-      <w:lvlText w:val="%8."/>
-      <w:lvlJc w:val="left"/>
-      <w:pPr>
-        <w:ind w:left="5760" w:hanging="360"/>
-      </w:pPr>
-    </w:lvl>
-    <w:lvl w:ilvl="8">
-      <w:start w:val="7"/>
-      <w:numFmt w:val="decimal"/>
-      <w:lvlText w:val="%9."/>
-      <w:lvlJc w:val="left"/>
-      <w:pPr>
-        <w:ind w:left="6480" w:hanging="360"/>
-      </w:pPr>
-    </w:lvl>
-  </w:abstractNum>
-  <w:num w:numId="1" w16cid:durableId="1033188111">
+  <w:num w:numId="1" w16cid:durableId="454833661">
     <w:abstractNumId w:val="0"/>
   </w:num>
-  <w:num w:numId="2" w16cid:durableId="2112311416">
+  <w:num w:numId="2" w16cid:durableId="1203514164">
     <w:abstractNumId w:val="1"/>
   </w:num>
-  <w:num w:numId="3" w16cid:durableId="1440181839">
+  <w:num w:numId="3" w16cid:durableId="1981569777">
     <w:abstractNumId w:val="1"/>
   </w:num>
-  <w:num w:numId="4" w16cid:durableId="511645537">
-    <w:abstractNumId w:val="2"/>
-    <w:lvlOverride w:ilvl="0">
-      <w:startOverride w:val="1"/>
-    </w:lvlOverride>
-    <w:lvlOverride w:ilvl="1">
-      <w:startOverride w:val="1"/>
-    </w:lvlOverride>
-    <w:lvlOverride w:ilvl="2">
-      <w:startOverride w:val="1"/>
-    </w:lvlOverride>
-    <w:lvlOverride w:ilvl="3">
-      <w:startOverride w:val="1"/>
-    </w:lvlOverride>
-    <w:lvlOverride w:ilvl="4">
-      <w:startOverride w:val="1"/>
-    </w:lvlOverride>
-    <w:lvlOverride w:ilvl="5">
-      <w:startOverride w:val="1"/>
-    </w:lvlOverride>
-    <w:lvlOverride w:ilvl="6">
-      <w:startOverride w:val="1"/>
-    </w:lvlOverride>
-    <w:lvlOverride w:ilvl="7">
-      <w:startOverride w:val="1"/>
-    </w:lvlOverride>
-    <w:lvlOverride w:ilvl="8">
-      <w:startOverride w:val="1"/>
-    </w:lvlOverride>
-  </w:num>
-  <w:num w:numId="5" w16cid:durableId="454325366">
-    <w:abstractNumId w:val="3"/>
-    <w:lvlOverride w:ilvl="0">
-      <w:startOverride w:val="2"/>
-    </w:lvlOverride>
-    <w:lvlOverride w:ilvl="1">
-      <w:startOverride w:val="2"/>
-    </w:lvlOverride>
-    <w:lvlOverride w:ilvl="2">
-      <w:startOverride w:val="2"/>
-    </w:lvlOverride>
-    <w:lvlOverride w:ilvl="3">
-      <w:startOverride w:val="2"/>
-    </w:lvlOverride>
-    <w:lvlOverride w:ilvl="4">
-      <w:startOverride w:val="2"/>
-    </w:lvlOverride>
-    <w:lvlOverride w:ilvl="5">
-      <w:startOverride w:val="2"/>
-    </w:lvlOverride>
-    <w:lvlOverride w:ilvl="6">
-      <w:startOverride w:val="2"/>
-    </w:lvlOverride>
-    <w:lvlOverride w:ilvl="7">
-      <w:startOverride w:val="2"/>
-    </w:lvlOverride>
-    <w:lvlOverride w:ilvl="8">
-      <w:startOverride w:val="2"/>
-    </w:lvlOverride>
-  </w:num>
-  <w:num w:numId="6" w16cid:durableId="1656258147">
+  <w:num w:numId="4" w16cid:durableId="1781290622">
     <w:abstractNumId w:val="1"/>
   </w:num>
-  <w:num w:numId="7" w16cid:durableId="789129181">
-    <w:abstractNumId w:val="4"/>
-    <w:lvlOverride w:ilvl="0">
-      <w:startOverride w:val="3"/>
-    </w:lvlOverride>
-    <w:lvlOverride w:ilvl="1">
-      <w:startOverride w:val="3"/>
-    </w:lvlOverride>
-    <w:lvlOverride w:ilvl="2">
-      <w:startOverride w:val="3"/>
-    </w:lvlOverride>
-    <w:lvlOverride w:ilvl="3">
-      <w:startOverride w:val="3"/>
-    </w:lvlOverride>
-    <w:lvlOverride w:ilvl="4">
-      <w:startOverride w:val="3"/>
-    </w:lvlOverride>
-    <w:lvlOverride w:ilvl="5">
-      <w:startOverride w:val="3"/>
-    </w:lvlOverride>
-    <w:lvlOverride w:ilvl="6">
-      <w:startOverride w:val="3"/>
-    </w:lvlOverride>
-    <w:lvlOverride w:ilvl="7">
-      <w:startOverride w:val="3"/>
-    </w:lvlOverride>
-    <w:lvlOverride w:ilvl="8">
-      <w:startOverride w:val="3"/>
-    </w:lvlOverride>
-  </w:num>
-  <w:num w:numId="8" w16cid:durableId="1235121806">
-    <w:abstractNumId w:val="5"/>
-    <w:lvlOverride w:ilvl="0">
-      <w:startOverride w:val="4"/>
-    </w:lvlOverride>
-    <w:lvlOverride w:ilvl="1">
-      <w:startOverride w:val="4"/>
-    </w:lvlOverride>
-    <w:lvlOverride w:ilvl="2">
-      <w:startOverride w:val="4"/>
-    </w:lvlOverride>
-    <w:lvlOverride w:ilvl="3">
-      <w:startOverride w:val="4"/>
-    </w:lvlOverride>
-    <w:lvlOverride w:ilvl="4">
-      <w:startOverride w:val="4"/>
-    </w:lvlOverride>
-    <w:lvlOverride w:ilvl="5">
-      <w:startOverride w:val="4"/>
-    </w:lvlOverride>
-    <w:lvlOverride w:ilvl="6">
-      <w:startOverride w:val="4"/>
-    </w:lvlOverride>
-    <w:lvlOverride w:ilvl="7">
-      <w:startOverride w:val="4"/>
-    </w:lvlOverride>
-    <w:lvlOverride w:ilvl="8">
-      <w:startOverride w:val="4"/>
-    </w:lvlOverride>
-  </w:num>
-  <w:num w:numId="9" w16cid:durableId="1223253522">
-    <w:abstractNumId w:val="6"/>
-    <w:lvlOverride w:ilvl="0">
-      <w:startOverride w:val="5"/>
-    </w:lvlOverride>
-    <w:lvlOverride w:ilvl="1">
-      <w:startOverride w:val="5"/>
-    </w:lvlOverride>
-    <w:lvlOverride w:ilvl="2">
-      <w:startOverride w:val="5"/>
-    </w:lvlOverride>
-    <w:lvlOverride w:ilvl="3">
-      <w:startOverride w:val="5"/>
-    </w:lvlOverride>
-    <w:lvlOverride w:ilvl="4">
-      <w:startOverride w:val="5"/>
-    </w:lvlOverride>
-    <w:lvlOverride w:ilvl="5">
-      <w:startOverride w:val="5"/>
-    </w:lvlOverride>
-    <w:lvlOverride w:ilvl="6">
-      <w:startOverride w:val="5"/>
-    </w:lvlOverride>
-    <w:lvlOverride w:ilvl="7">
-      <w:startOverride w:val="5"/>
-    </w:lvlOverride>
-    <w:lvlOverride w:ilvl="8">
-      <w:startOverride w:val="5"/>
-    </w:lvlOverride>
-  </w:num>
-  <w:num w:numId="10" w16cid:durableId="1232040416">
+  <w:num w:numId="5" w16cid:durableId="1633364519">
     <w:abstractNumId w:val="1"/>
   </w:num>
-  <w:num w:numId="11" w16cid:durableId="1678917868">
-    <w:abstractNumId w:val="7"/>
-    <w:lvlOverride w:ilvl="0">
-      <w:startOverride w:val="6"/>
-    </w:lvlOverride>
-    <w:lvlOverride w:ilvl="1">
-      <w:startOverride w:val="6"/>
-    </w:lvlOverride>
-    <w:lvlOverride w:ilvl="2">
-      <w:startOverride w:val="6"/>
-    </w:lvlOverride>
-    <w:lvlOverride w:ilvl="3">
-      <w:startOverride w:val="6"/>
-    </w:lvlOverride>
-    <w:lvlOverride w:ilvl="4">
-      <w:startOverride w:val="6"/>
-    </w:lvlOverride>
-    <w:lvlOverride w:ilvl="5">
-      <w:startOverride w:val="6"/>
-    </w:lvlOverride>
-    <w:lvlOverride w:ilvl="6">
-      <w:startOverride w:val="6"/>
-    </w:lvlOverride>
-    <w:lvlOverride w:ilvl="7">
-      <w:startOverride w:val="6"/>
-    </w:lvlOverride>
-    <w:lvlOverride w:ilvl="8">
-      <w:startOverride w:val="6"/>
-    </w:lvlOverride>
+  <w:num w:numId="6" w16cid:durableId="173883919">
+    <w:abstractNumId w:val="1"/>
   </w:num>
-  <w:num w:numId="12" w16cid:durableId="602686406">
-    <w:abstractNumId w:val="8"/>
-    <w:lvlOverride w:ilvl="0">
-      <w:startOverride w:val="7"/>
-    </w:lvlOverride>
-    <w:lvlOverride w:ilvl="1">
-      <w:startOverride w:val="7"/>
-    </w:lvlOverride>
-    <w:lvlOverride w:ilvl="2">
-      <w:startOverride w:val="7"/>
-    </w:lvlOverride>
-    <w:lvlOverride w:ilvl="3">
-      <w:startOverride w:val="7"/>
-    </w:lvlOverride>
-    <w:lvlOverride w:ilvl="4">
-      <w:startOverride w:val="7"/>
-    </w:lvlOverride>
-    <w:lvlOverride w:ilvl="5">
-      <w:startOverride w:val="7"/>
-    </w:lvlOverride>
-    <w:lvlOverride w:ilvl="6">
-      <w:startOverride w:val="7"/>
-    </w:lvlOverride>
-    <w:lvlOverride w:ilvl="7">
-      <w:startOverride w:val="7"/>
-    </w:lvlOverride>
-    <w:lvlOverride w:ilvl="8">
-      <w:startOverride w:val="7"/>
-    </w:lvlOverride>
+  <w:num w:numId="7" w16cid:durableId="1931692757">
+    <w:abstractNumId w:val="1"/>
+  </w:num>
+  <w:num w:numId="8" w16cid:durableId="1505702453">
+    <w:abstractNumId w:val="1"/>
+  </w:num>
+  <w:num w:numId="9" w16cid:durableId="118687436">
+    <w:abstractNumId w:val="1"/>
+  </w:num>
+  <w:num w:numId="10" w16cid:durableId="1453400687">
+    <w:abstractNumId w:val="1"/>
+  </w:num>
+  <w:num w:numId="11" w16cid:durableId="1876431295">
+    <w:abstractNumId w:val="1"/>
   </w:num>
 </w:numbering>
 </file>
@@ -2543,8 +1820,6 @@
     </w:pPr>
     <w:rPr>
       <w:rFonts w:asciiTheme="majorHAnsi" w:eastAsiaTheme="majorEastAsia" w:hAnsiTheme="majorHAnsi" w:cstheme="majorBidi"/>
-      <w:spacing w:val="-10"/>
-      <w:kern w:val="28"/>
       <w:sz w:val="56"/>
       <w:szCs w:val="56"/>
     </w:rPr>
@@ -2557,8 +1832,6 @@
     <w:rsid w:val="00A10FD9"/>
     <w:rPr>
       <w:rFonts w:asciiTheme="majorHAnsi" w:eastAsiaTheme="majorEastAsia" w:hAnsiTheme="majorHAnsi" w:cstheme="majorBidi"/>
-      <w:spacing w:val="-10"/>
-      <w:kern w:val="28"/>
       <w:sz w:val="56"/>
       <w:szCs w:val="56"/>
     </w:rPr>
@@ -2598,23 +1871,31 @@
   </w:style>
   <w:style w:type="paragraph" w:customStyle="1" w:styleId="Author">
     <w:name w:val="Author"/>
+    <w:basedOn w:val="Title"/>
     <w:next w:val="BodyText"/>
     <w:qFormat/>
     <w:pPr>
       <w:keepNext/>
       <w:keepLines/>
-      <w:jc w:val="center"/>
     </w:pPr>
+    <w:rPr>
+      <w:sz w:val="24"/>
+      <w:szCs w:val="24"/>
+    </w:rPr>
   </w:style>
   <w:style w:type="paragraph" w:styleId="Date">
     <w:name w:val="Date"/>
+    <w:basedOn w:val="Title"/>
     <w:next w:val="BodyText"/>
     <w:qFormat/>
     <w:pPr>
       <w:keepNext/>
       <w:keepLines/>
-      <w:jc w:val="center"/>
     </w:pPr>
+    <w:rPr>
+      <w:sz w:val="24"/>
+      <w:szCs w:val="24"/>
+    </w:rPr>
   </w:style>
   <w:style w:type="paragraph" w:customStyle="1" w:styleId="AbstractTitle">
     <w:name w:val="Abstract Title"/>
@@ -2931,7 +2212,7 @@
     <w:basedOn w:val="Normal"/>
     <w:link w:val="VerbatimChar"/>
     <w:pPr>
-      <w:shd w:val="clear" w:color="auto" w:fill="F8F8F8"/>
+      <w:shd w:val="clear" w:color="auto" w:fill="F1F3F5"/>
       <w:wordWrap w:val="0"/>
     </w:pPr>
   </w:style>
@@ -2941,9 +2222,9 @@
     <w:rPr>
       <w:rFonts w:ascii="Consolas" w:hAnsi="Consolas"/>
       <w:b/>
-      <w:color w:val="204A87"/>
-      <w:sz w:val="22"/>
-      <w:shd w:val="clear" w:color="auto" w:fill="F8F8F8"/>
+      <w:color w:val="003B4F"/>
+      <w:sz w:val="22"/>
+      <w:shd w:val="clear" w:color="auto" w:fill="F1F3F5"/>
     </w:rPr>
   </w:style>
   <w:style w:type="character" w:customStyle="1" w:styleId="DataTypeTok">
@@ -2951,9 +2232,9 @@
     <w:basedOn w:val="VerbatimChar"/>
     <w:rPr>
       <w:rFonts w:ascii="Consolas" w:hAnsi="Consolas"/>
-      <w:color w:val="204A87"/>
-      <w:sz w:val="22"/>
-      <w:shd w:val="clear" w:color="auto" w:fill="F8F8F8"/>
+      <w:color w:val="AD0000"/>
+      <w:sz w:val="22"/>
+      <w:shd w:val="clear" w:color="auto" w:fill="F1F3F5"/>
     </w:rPr>
   </w:style>
   <w:style w:type="character" w:customStyle="1" w:styleId="DecValTok">
@@ -2961,9 +2242,9 @@
     <w:basedOn w:val="VerbatimChar"/>
     <w:rPr>
       <w:rFonts w:ascii="Consolas" w:hAnsi="Consolas"/>
-      <w:color w:val="0000CF"/>
-      <w:sz w:val="22"/>
-      <w:shd w:val="clear" w:color="auto" w:fill="F8F8F8"/>
+      <w:color w:val="AD0000"/>
+      <w:sz w:val="22"/>
+      <w:shd w:val="clear" w:color="auto" w:fill="F1F3F5"/>
     </w:rPr>
   </w:style>
   <w:style w:type="character" w:customStyle="1" w:styleId="BaseNTok">
@@ -2971,9 +2252,9 @@
     <w:basedOn w:val="VerbatimChar"/>
     <w:rPr>
       <w:rFonts w:ascii="Consolas" w:hAnsi="Consolas"/>
-      <w:color w:val="0000CF"/>
-      <w:sz w:val="22"/>
-      <w:shd w:val="clear" w:color="auto" w:fill="F8F8F8"/>
+      <w:color w:val="AD0000"/>
+      <w:sz w:val="22"/>
+      <w:shd w:val="clear" w:color="auto" w:fill="F1F3F5"/>
     </w:rPr>
   </w:style>
   <w:style w:type="character" w:customStyle="1" w:styleId="FloatTok">
@@ -2981,9 +2262,9 @@
     <w:basedOn w:val="VerbatimChar"/>
     <w:rPr>
       <w:rFonts w:ascii="Consolas" w:hAnsi="Consolas"/>
-      <w:color w:val="0000CF"/>
-      <w:sz w:val="22"/>
-      <w:shd w:val="clear" w:color="auto" w:fill="F8F8F8"/>
+      <w:color w:val="AD0000"/>
+      <w:sz w:val="22"/>
+      <w:shd w:val="clear" w:color="auto" w:fill="F1F3F5"/>
     </w:rPr>
   </w:style>
   <w:style w:type="character" w:customStyle="1" w:styleId="ConstantTok">
@@ -2993,7 +2274,7 @@
       <w:rFonts w:ascii="Consolas" w:hAnsi="Consolas"/>
       <w:color w:val="8F5902"/>
       <w:sz w:val="22"/>
-      <w:shd w:val="clear" w:color="auto" w:fill="F8F8F8"/>
+      <w:shd w:val="clear" w:color="auto" w:fill="F1F3F5"/>
     </w:rPr>
   </w:style>
   <w:style w:type="character" w:customStyle="1" w:styleId="CharTok">
@@ -3001,9 +2282,9 @@
     <w:basedOn w:val="VerbatimChar"/>
     <w:rPr>
       <w:rFonts w:ascii="Consolas" w:hAnsi="Consolas"/>
-      <w:color w:val="4E9A06"/>
-      <w:sz w:val="22"/>
-      <w:shd w:val="clear" w:color="auto" w:fill="F8F8F8"/>
+      <w:color w:val="20794D"/>
+      <w:sz w:val="22"/>
+      <w:shd w:val="clear" w:color="auto" w:fill="F1F3F5"/>
     </w:rPr>
   </w:style>
   <w:style w:type="character" w:customStyle="1" w:styleId="SpecialCharTok">
@@ -3011,10 +2292,9 @@
     <w:basedOn w:val="VerbatimChar"/>
     <w:rPr>
       <w:rFonts w:ascii="Consolas" w:hAnsi="Consolas"/>
-      <w:b/>
-      <w:color w:val="CE5C00"/>
-      <w:sz w:val="22"/>
-      <w:shd w:val="clear" w:color="auto" w:fill="F8F8F8"/>
+      <w:color w:val="5E5E5E"/>
+      <w:sz w:val="22"/>
+      <w:shd w:val="clear" w:color="auto" w:fill="F1F3F5"/>
     </w:rPr>
   </w:style>
   <w:style w:type="character" w:customStyle="1" w:styleId="StringTok">
@@ -3022,9 +2302,9 @@
     <w:basedOn w:val="VerbatimChar"/>
     <w:rPr>
       <w:rFonts w:ascii="Consolas" w:hAnsi="Consolas"/>
-      <w:color w:val="4E9A06"/>
-      <w:sz w:val="22"/>
-      <w:shd w:val="clear" w:color="auto" w:fill="F8F8F8"/>
+      <w:color w:val="20794D"/>
+      <w:sz w:val="22"/>
+      <w:shd w:val="clear" w:color="auto" w:fill="F1F3F5"/>
     </w:rPr>
   </w:style>
   <w:style w:type="character" w:customStyle="1" w:styleId="VerbatimStringTok">
@@ -3032,9 +2312,9 @@
     <w:basedOn w:val="VerbatimChar"/>
     <w:rPr>
       <w:rFonts w:ascii="Consolas" w:hAnsi="Consolas"/>
-      <w:color w:val="4E9A06"/>
-      <w:sz w:val="22"/>
-      <w:shd w:val="clear" w:color="auto" w:fill="F8F8F8"/>
+      <w:color w:val="20794D"/>
+      <w:sz w:val="22"/>
+      <w:shd w:val="clear" w:color="auto" w:fill="F1F3F5"/>
     </w:rPr>
   </w:style>
   <w:style w:type="character" w:customStyle="1" w:styleId="SpecialStringTok">
@@ -3042,9 +2322,9 @@
     <w:basedOn w:val="VerbatimChar"/>
     <w:rPr>
       <w:rFonts w:ascii="Consolas" w:hAnsi="Consolas"/>
-      <w:color w:val="4E9A06"/>
-      <w:sz w:val="22"/>
-      <w:shd w:val="clear" w:color="auto" w:fill="F8F8F8"/>
+      <w:color w:val="20794D"/>
+      <w:sz w:val="22"/>
+      <w:shd w:val="clear" w:color="auto" w:fill="F1F3F5"/>
     </w:rPr>
   </w:style>
   <w:style w:type="character" w:customStyle="1" w:styleId="ImportTok">
@@ -3052,8 +2332,9 @@
     <w:basedOn w:val="VerbatimChar"/>
     <w:rPr>
       <w:rFonts w:ascii="Consolas" w:hAnsi="Consolas"/>
-      <w:sz w:val="22"/>
-      <w:shd w:val="clear" w:color="auto" w:fill="F8F8F8"/>
+      <w:color w:val="00769E"/>
+      <w:sz w:val="22"/>
+      <w:shd w:val="clear" w:color="auto" w:fill="F1F3F5"/>
     </w:rPr>
   </w:style>
   <w:style w:type="character" w:customStyle="1" w:styleId="CommentTok">
@@ -3061,10 +2342,9 @@
     <w:basedOn w:val="VerbatimChar"/>
     <w:rPr>
       <w:rFonts w:ascii="Consolas" w:hAnsi="Consolas"/>
-      <w:i/>
-      <w:color w:val="8F5902"/>
-      <w:sz w:val="22"/>
-      <w:shd w:val="clear" w:color="auto" w:fill="F8F8F8"/>
+      <w:color w:val="5E5E5E"/>
+      <w:sz w:val="22"/>
+      <w:shd w:val="clear" w:color="auto" w:fill="F1F3F5"/>
     </w:rPr>
   </w:style>
   <w:style w:type="character" w:customStyle="1" w:styleId="DocumentationTok">
@@ -3072,11 +2352,10 @@
     <w:basedOn w:val="VerbatimChar"/>
     <w:rPr>
       <w:rFonts w:ascii="Consolas" w:hAnsi="Consolas"/>
-      <w:b/>
       <w:i/>
-      <w:color w:val="8F5902"/>
-      <w:sz w:val="22"/>
-      <w:shd w:val="clear" w:color="auto" w:fill="F8F8F8"/>
+      <w:color w:val="5E5E5E"/>
+      <w:sz w:val="22"/>
+      <w:shd w:val="clear" w:color="auto" w:fill="F1F3F5"/>
     </w:rPr>
   </w:style>
   <w:style w:type="character" w:customStyle="1" w:styleId="AnnotationTok">
@@ -3084,11 +2363,9 @@
     <w:basedOn w:val="VerbatimChar"/>
     <w:rPr>
       <w:rFonts w:ascii="Consolas" w:hAnsi="Consolas"/>
-      <w:b/>
-      <w:i/>
-      <w:color w:val="8F5902"/>
-      <w:sz w:val="22"/>
-      <w:shd w:val="clear" w:color="auto" w:fill="F8F8F8"/>
+      <w:color w:val="5E5E5E"/>
+      <w:sz w:val="22"/>
+      <w:shd w:val="clear" w:color="auto" w:fill="F1F3F5"/>
     </w:rPr>
   </w:style>
   <w:style w:type="character" w:customStyle="1" w:styleId="CommentVarTok">
@@ -3096,11 +2373,10 @@
     <w:basedOn w:val="VerbatimChar"/>
     <w:rPr>
       <w:rFonts w:ascii="Consolas" w:hAnsi="Consolas"/>
-      <w:b/>
       <w:i/>
-      <w:color w:val="8F5902"/>
-      <w:sz w:val="22"/>
-      <w:shd w:val="clear" w:color="auto" w:fill="F8F8F8"/>
+      <w:color w:val="5E5E5E"/>
+      <w:sz w:val="22"/>
+      <w:shd w:val="clear" w:color="auto" w:fill="F1F3F5"/>
     </w:rPr>
   </w:style>
   <w:style w:type="character" w:customStyle="1" w:styleId="OtherTok">
@@ -3108,9 +2384,9 @@
     <w:basedOn w:val="VerbatimChar"/>
     <w:rPr>
       <w:rFonts w:ascii="Consolas" w:hAnsi="Consolas"/>
-      <w:color w:val="8F5902"/>
-      <w:sz w:val="22"/>
-      <w:shd w:val="clear" w:color="auto" w:fill="F8F8F8"/>
+      <w:color w:val="003B4F"/>
+      <w:sz w:val="22"/>
+      <w:shd w:val="clear" w:color="auto" w:fill="F1F3F5"/>
     </w:rPr>
   </w:style>
   <w:style w:type="character" w:customStyle="1" w:styleId="FunctionTok">
@@ -3118,10 +2394,9 @@
     <w:basedOn w:val="VerbatimChar"/>
     <w:rPr>
       <w:rFonts w:ascii="Consolas" w:hAnsi="Consolas"/>
-      <w:b/>
-      <w:color w:val="204A87"/>
-      <w:sz w:val="22"/>
-      <w:shd w:val="clear" w:color="auto" w:fill="F8F8F8"/>
+      <w:color w:val="4758AB"/>
+      <w:sz w:val="22"/>
+      <w:shd w:val="clear" w:color="auto" w:fill="F1F3F5"/>
     </w:rPr>
   </w:style>
   <w:style w:type="character" w:customStyle="1" w:styleId="VariableTok">
@@ -3129,9 +2404,9 @@
     <w:basedOn w:val="VerbatimChar"/>
     <w:rPr>
       <w:rFonts w:ascii="Consolas" w:hAnsi="Consolas"/>
-      <w:color w:val="000000"/>
-      <w:sz w:val="22"/>
-      <w:shd w:val="clear" w:color="auto" w:fill="F8F8F8"/>
+      <w:color w:val="111111"/>
+      <w:sz w:val="22"/>
+      <w:shd w:val="clear" w:color="auto" w:fill="F1F3F5"/>
     </w:rPr>
   </w:style>
   <w:style w:type="character" w:customStyle="1" w:styleId="ControlFlowTok">
@@ -3140,9 +2415,9 @@
     <w:rPr>
       <w:rFonts w:ascii="Consolas" w:hAnsi="Consolas"/>
       <w:b/>
-      <w:color w:val="204A87"/>
-      <w:sz w:val="22"/>
-      <w:shd w:val="clear" w:color="auto" w:fill="F8F8F8"/>
+      <w:color w:val="003B4F"/>
+      <w:sz w:val="22"/>
+      <w:shd w:val="clear" w:color="auto" w:fill="F1F3F5"/>
     </w:rPr>
   </w:style>
   <w:style w:type="character" w:customStyle="1" w:styleId="OperatorTok">
@@ -3150,10 +2425,9 @@
     <w:basedOn w:val="VerbatimChar"/>
     <w:rPr>
       <w:rFonts w:ascii="Consolas" w:hAnsi="Consolas"/>
-      <w:b/>
-      <w:color w:val="CE5C00"/>
-      <w:sz w:val="22"/>
-      <w:shd w:val="clear" w:color="auto" w:fill="F8F8F8"/>
+      <w:color w:val="5E5E5E"/>
+      <w:sz w:val="22"/>
+      <w:shd w:val="clear" w:color="auto" w:fill="F1F3F5"/>
     </w:rPr>
   </w:style>
   <w:style w:type="character" w:customStyle="1" w:styleId="BuiltInTok">
@@ -3161,8 +2435,9 @@
     <w:basedOn w:val="VerbatimChar"/>
     <w:rPr>
       <w:rFonts w:ascii="Consolas" w:hAnsi="Consolas"/>
-      <w:sz w:val="22"/>
-      <w:shd w:val="clear" w:color="auto" w:fill="F8F8F8"/>
+      <w:color w:val="003B4F"/>
+      <w:sz w:val="22"/>
+      <w:shd w:val="clear" w:color="auto" w:fill="F1F3F5"/>
     </w:rPr>
   </w:style>
   <w:style w:type="character" w:customStyle="1" w:styleId="ExtensionTok">
@@ -3170,8 +2445,9 @@
     <w:basedOn w:val="VerbatimChar"/>
     <w:rPr>
       <w:rFonts w:ascii="Consolas" w:hAnsi="Consolas"/>
-      <w:sz w:val="22"/>
-      <w:shd w:val="clear" w:color="auto" w:fill="F8F8F8"/>
+      <w:color w:val="003B4F"/>
+      <w:sz w:val="22"/>
+      <w:shd w:val="clear" w:color="auto" w:fill="F1F3F5"/>
     </w:rPr>
   </w:style>
   <w:style w:type="character" w:customStyle="1" w:styleId="PreprocessorTok">
@@ -3179,10 +2455,9 @@
     <w:basedOn w:val="VerbatimChar"/>
     <w:rPr>
       <w:rFonts w:ascii="Consolas" w:hAnsi="Consolas"/>
-      <w:i/>
-      <w:color w:val="8F5902"/>
-      <w:sz w:val="22"/>
-      <w:shd w:val="clear" w:color="auto" w:fill="F8F8F8"/>
+      <w:color w:val="AD0000"/>
+      <w:sz w:val="22"/>
+      <w:shd w:val="clear" w:color="auto" w:fill="F1F3F5"/>
     </w:rPr>
   </w:style>
   <w:style w:type="character" w:customStyle="1" w:styleId="AttributeTok">
@@ -3190,9 +2465,9 @@
     <w:basedOn w:val="VerbatimChar"/>
     <w:rPr>
       <w:rFonts w:ascii="Consolas" w:hAnsi="Consolas"/>
-      <w:color w:val="204A87"/>
-      <w:sz w:val="22"/>
-      <w:shd w:val="clear" w:color="auto" w:fill="F8F8F8"/>
+      <w:color w:val="657422"/>
+      <w:sz w:val="22"/>
+      <w:shd w:val="clear" w:color="auto" w:fill="F1F3F5"/>
     </w:rPr>
   </w:style>
   <w:style w:type="character" w:customStyle="1" w:styleId="RegionMarkerTok">
@@ -3200,8 +2475,9 @@
     <w:basedOn w:val="VerbatimChar"/>
     <w:rPr>
       <w:rFonts w:ascii="Consolas" w:hAnsi="Consolas"/>
-      <w:sz w:val="22"/>
-      <w:shd w:val="clear" w:color="auto" w:fill="F8F8F8"/>
+      <w:color w:val="003B4F"/>
+      <w:sz w:val="22"/>
+      <w:shd w:val="clear" w:color="auto" w:fill="F1F3F5"/>
     </w:rPr>
   </w:style>
   <w:style w:type="character" w:customStyle="1" w:styleId="InformationTok">
@@ -3209,11 +2485,9 @@
     <w:basedOn w:val="VerbatimChar"/>
     <w:rPr>
       <w:rFonts w:ascii="Consolas" w:hAnsi="Consolas"/>
-      <w:b/>
-      <w:i/>
-      <w:color w:val="8F5902"/>
-      <w:sz w:val="22"/>
-      <w:shd w:val="clear" w:color="auto" w:fill="F8F8F8"/>
+      <w:color w:val="5E5E5E"/>
+      <w:sz w:val="22"/>
+      <w:shd w:val="clear" w:color="auto" w:fill="F1F3F5"/>
     </w:rPr>
   </w:style>
   <w:style w:type="character" w:customStyle="1" w:styleId="WarningTok">
@@ -3221,11 +2495,10 @@
     <w:basedOn w:val="VerbatimChar"/>
     <w:rPr>
       <w:rFonts w:ascii="Consolas" w:hAnsi="Consolas"/>
-      <w:b/>
       <w:i/>
-      <w:color w:val="8F5902"/>
-      <w:sz w:val="22"/>
-      <w:shd w:val="clear" w:color="auto" w:fill="F8F8F8"/>
+      <w:color w:val="5E5E5E"/>
+      <w:sz w:val="22"/>
+      <w:shd w:val="clear" w:color="auto" w:fill="F1F3F5"/>
     </w:rPr>
   </w:style>
   <w:style w:type="character" w:customStyle="1" w:styleId="AlertTok">
@@ -3233,9 +2506,9 @@
     <w:basedOn w:val="VerbatimChar"/>
     <w:rPr>
       <w:rFonts w:ascii="Consolas" w:hAnsi="Consolas"/>
-      <w:color w:val="EF2929"/>
-      <w:sz w:val="22"/>
-      <w:shd w:val="clear" w:color="auto" w:fill="F8F8F8"/>
+      <w:color w:val="AD0000"/>
+      <w:sz w:val="22"/>
+      <w:shd w:val="clear" w:color="auto" w:fill="F1F3F5"/>
     </w:rPr>
   </w:style>
   <w:style w:type="character" w:customStyle="1" w:styleId="ErrorTok">
@@ -3243,10 +2516,9 @@
     <w:basedOn w:val="VerbatimChar"/>
     <w:rPr>
       <w:rFonts w:ascii="Consolas" w:hAnsi="Consolas"/>
-      <w:b/>
-      <w:color w:val="A40000"/>
-      <w:sz w:val="22"/>
-      <w:shd w:val="clear" w:color="auto" w:fill="F8F8F8"/>
+      <w:color w:val="AD0000"/>
+      <w:sz w:val="22"/>
+      <w:shd w:val="clear" w:color="auto" w:fill="F1F3F5"/>
     </w:rPr>
   </w:style>
   <w:style w:type="character" w:customStyle="1" w:styleId="NormalTok">
@@ -3254,8 +2526,9 @@
     <w:basedOn w:val="VerbatimChar"/>
     <w:rPr>
       <w:rFonts w:ascii="Consolas" w:hAnsi="Consolas"/>
-      <w:sz w:val="22"/>
-      <w:shd w:val="clear" w:color="auto" w:fill="F8F8F8"/>
+      <w:color w:val="003B4F"/>
+      <w:sz w:val="22"/>
+      <w:shd w:val="clear" w:color="auto" w:fill="F1F3F5"/>
     </w:rPr>
   </w:style>
 </w:styles>

</xml_diff>